<commit_message>
Sync user's template edits from the plugin folder to src
book.odt: rebuilt to drive chapter page breaks + page-style switching from
the named heading styles themselves (Heading 1 -> Chapter Page, Heading 1
Frontmatter -> Chapter Page Frontmatter) instead of the old Converted*
master-page-per-section layout; TOC/Preface headers moved to LibreOffice's
outline-level-based <text:chapter> field. book.docx/document.docx also
carry the user's own manual edits from this session (footer settings).
"Research Seminar F2026-W2027 - Course Outline.odt" removed (not an export
template).

The user copied these from .obsidian/plugins/scholar-weave/templates/ (where
they'd been editing directly in LibreOffice/Word) into src themselves; this
commit just brings git up to date with that. See commit c70e257 for the
matching sw_export_odt_merge.py changes that support the new book.odt
structure.

Co-Authored-By: Claude Sonnet 5 <noreply@anthropic.com>
</commit_message>
<xml_diff>
--- a/templates/document.docx
+++ b/templates/document.docx
@@ -44,7 +44,7 @@
     </w:p>
     <w:p>
       <w:pPr>
-        <w:pStyle w:val="Abstract"/>
+        <w:pStyle w:val="BodyText"/>
       </w:pPr>
       <w:r>
         <w:t>Abstract</w:t>
@@ -554,6 +554,9 @@
         <w:keepNext/>
       </w:pPr>
       <w:r>
+        <w:rPr>
+          <w:noProof/>
+        </w:rPr>
         <w:drawing>
           <wp:inline distT="0" distB="0" distL="0" distR="0" wp14:anchorId="3A1AF2B0" wp14:editId="3FB01BC3">
             <wp:extent cx="5943600" cy="5188585"/>

</xml_diff>